<commit_message>
Made delpoy only for main branch
</commit_message>
<xml_diff>
--- a/pr6.docx
+++ b/pr6.docx
@@ -2718,6 +2718,398 @@
           <w:szCs w:val="28"/>
         </w:rPr>
       </w:r>
+      <w:r>
+        <w:rPr>
+          <w:rFonts w:ascii="Times New Roman" w:hAnsi="Times New Roman" w:cs="Times New Roman"/>
+          <w:sz w:val="28"/>
+          <w:szCs w:val="28"/>
+        </w:rPr>
+      </w:r>
+    </w:p>
+    <w:p>
+      <w:pPr>
+        <w:pStyle w:val="1301"/>
+        <w:pBdr/>
+        <w:spacing/>
+        <w:ind/>
+        <w:rPr>
+          <w:rFonts w:ascii="Times New Roman" w:hAnsi="Times New Roman" w:cs="Times New Roman"/>
+          <w:sz w:val="28"/>
+          <w:szCs w:val="28"/>
+          <w:highlight w:val="none"/>
+        </w:rPr>
+      </w:pPr>
+      <w:r>
+        <w:rPr>
+          <w:rFonts w:ascii="Times New Roman" w:hAnsi="Times New Roman" w:cs="Times New Roman"/>
+          <w:sz w:val="28"/>
+          <w:szCs w:val="28"/>
+        </w:rPr>
+      </w:r>
+      <w:r>
+        <mc:AlternateContent>
+          <mc:Choice Requires="wpg">
+            <w:drawing>
+              <wp:inline xmlns:wp="http://schemas.openxmlformats.org/drawingml/2006/wordprocessingDrawing" distT="0" distB="0" distL="0" distR="0">
+                <wp:extent cx="6332220" cy="1154933"/>
+                <wp:effectExtent l="0" t="0" r="0" b="0"/>
+                <wp:docPr id="10" name=""/>
+                <wp:cNvGraphicFramePr>
+                  <a:graphicFrameLocks xmlns:a="http://schemas.openxmlformats.org/drawingml/2006/main" noChangeAspect="1"/>
+                </wp:cNvGraphicFramePr>
+                <a:graphic xmlns:a="http://schemas.openxmlformats.org/drawingml/2006/main">
+                  <a:graphicData uri="http://schemas.openxmlformats.org/drawingml/2006/picture">
+                    <pic:pic xmlns:pic="http://schemas.openxmlformats.org/drawingml/2006/picture">
+                      <pic:nvPicPr>
+                        <pic:cNvPr id="1343520180" name=""/>
+                        <pic:cNvPicPr>
+                          <a:picLocks noChangeAspect="1"/>
+                        </pic:cNvPicPr>
+                        <pic:nvPr/>
+                      </pic:nvPicPr>
+                      <pic:blipFill rotWithShape="1">
+                        <a:blip r:embed="rId19"/>
+                        <a:stretch/>
+                      </pic:blipFill>
+                      <pic:spPr bwMode="auto">
+                        <a:xfrm>
+                          <a:off x="0" y="0"/>
+                          <a:ext cx="6332220" cy="1154932"/>
+                        </a:xfrm>
+                        <a:prstGeom prst="rect">
+                          <a:avLst/>
+                        </a:prstGeom>
+                      </pic:spPr>
+                    </pic:pic>
+                  </a:graphicData>
+                </a:graphic>
+              </wp:inline>
+            </w:drawing>
+          </mc:Choice>
+          <mc:Fallback>
+            <w:pict>
+              <v:shapetype id="_x0000_t75" coordsize="21600,21600" o:spt="75" o:preferrelative="t" path="m@4@5l@4@11@9@11@9@5xe" filled="f" stroked="f">
+                <v:stroke joinstyle="miter"/>
+                <v:formulas>
+                  <v:f eqn="if lineDrawn pixelLineWidth 0"/>
+                  <v:f eqn="sum @0 1 0"/>
+                  <v:f eqn="sum 0 0 @1"/>
+                  <v:f eqn="prod @2 1 2"/>
+                  <v:f eqn="prod @3 21600 pixelWidth"/>
+                  <v:f eqn="prod @3 21600 pixelHeight"/>
+                  <v:f eqn="sum @0 0 1"/>
+                  <v:f eqn="prod @6 1 2"/>
+                  <v:f eqn="prod @7 21600 pixelWidth"/>
+                  <v:f eqn="sum @8 21600 0"/>
+                  <v:f eqn="prod @7 21600 pixelHeight"/>
+                  <v:f eqn="sum @10 21600 0"/>
+                </v:formulas>
+                <v:path o:extrusionok="f" gradientshapeok="t" o:connecttype="rect"/>
+                <o:lock v:ext="edit" aspectratio="t"/>
+              </v:shapetype>
+              <v:shape id="_x0000_i32" o:spid="_x0000_s32" type="#_x0000_t75" style="width:498.60pt;height:90.94pt;mso-wrap-distance-left:0.00pt;mso-wrap-distance-top:0.00pt;mso-wrap-distance-right:0.00pt;mso-wrap-distance-bottom:0.00pt;z-index:1;" stroked="false">
+                <v:imagedata r:id="rId19" o:title=""/>
+                <o:lock v:ext="edit" rotation="t"/>
+              </v:shape>
+            </w:pict>
+          </mc:Fallback>
+        </mc:AlternateContent>
+      </w:r>
+      <w:r>
+        <w:rPr>
+          <w:rFonts w:ascii="Times New Roman" w:hAnsi="Times New Roman" w:cs="Times New Roman"/>
+          <w:sz w:val="28"/>
+          <w:szCs w:val="28"/>
+        </w:rPr>
+      </w:r>
+      <w:r>
+        <w:rPr>
+          <w:rFonts w:ascii="Times New Roman" w:hAnsi="Times New Roman" w:cs="Times New Roman"/>
+          <w:sz w:val="28"/>
+          <w:szCs w:val="28"/>
+        </w:rPr>
+      </w:r>
+    </w:p>
+    <w:p>
+      <w:pPr>
+        <w:pStyle w:val="1301"/>
+        <w:pBdr/>
+        <w:spacing/>
+        <w:ind/>
+        <w:jc w:val="center"/>
+        <w:rPr>
+          <w:rFonts w:ascii="Times New Roman" w:hAnsi="Times New Roman" w:cs="Times New Roman"/>
+          <w:sz w:val="28"/>
+          <w:szCs w:val="28"/>
+        </w:rPr>
+      </w:pPr>
+      <w:r>
+        <w:rPr>
+          <w:rFonts w:ascii="Times New Roman" w:hAnsi="Times New Roman" w:cs="Times New Roman"/>
+          <w:sz w:val="28"/>
+          <w:szCs w:val="28"/>
+          <w:highlight w:val="none"/>
+          <w:lang w:val="uk-UA"/>
+        </w:rPr>
+        <w:t xml:space="preserve">Створення навмисної помилки</w:t>
+      </w:r>
+      <w:r>
+        <w:rPr>
+          <w:rFonts w:ascii="Times New Roman" w:hAnsi="Times New Roman" w:cs="Times New Roman"/>
+          <w:sz w:val="28"/>
+          <w:szCs w:val="28"/>
+          <w:highlight w:val="none"/>
+        </w:rPr>
+      </w:r>
+    </w:p>
+    <w:p>
+      <w:pPr>
+        <w:pStyle w:val="1301"/>
+        <w:pBdr/>
+        <w:spacing/>
+        <w:ind/>
+        <w:rPr>
+          <w:rFonts w:ascii="Times New Roman" w:hAnsi="Times New Roman" w:cs="Times New Roman"/>
+          <w:sz w:val="28"/>
+          <w:szCs w:val="28"/>
+        </w:rPr>
+      </w:pPr>
+      <w:r>
+        <w:rPr>
+          <w:rFonts w:ascii="Times New Roman" w:hAnsi="Times New Roman" w:cs="Times New Roman"/>
+          <w:sz w:val="28"/>
+          <w:szCs w:val="28"/>
+        </w:rPr>
+      </w:r>
+      <w:r>
+        <w:rPr>
+          <w:rFonts w:ascii="Times New Roman" w:hAnsi="Times New Roman" w:cs="Times New Roman"/>
+          <w:sz w:val="28"/>
+          <w:szCs w:val="28"/>
+        </w:rPr>
+      </w:r>
+      <w:r>
+        <w:rPr>
+          <w:rFonts w:ascii="Times New Roman" w:hAnsi="Times New Roman" w:cs="Times New Roman"/>
+          <w:sz w:val="28"/>
+          <w:szCs w:val="28"/>
+        </w:rPr>
+      </w:r>
+    </w:p>
+    <w:p>
+      <w:pPr>
+        <w:pStyle w:val="1301"/>
+        <w:pBdr/>
+        <w:spacing/>
+        <w:ind/>
+        <w:jc w:val="center"/>
+        <w:rPr>
+          <w:rFonts w:ascii="Times New Roman" w:hAnsi="Times New Roman" w:cs="Times New Roman"/>
+          <w:sz w:val="28"/>
+          <w:szCs w:val="28"/>
+          <w:highlight w:val="none"/>
+        </w:rPr>
+      </w:pPr>
+      <w:r>
+        <w:rPr>
+          <w:rFonts w:ascii="Times New Roman" w:hAnsi="Times New Roman" w:cs="Times New Roman"/>
+          <w:sz w:val="28"/>
+          <w:szCs w:val="28"/>
+        </w:rPr>
+      </w:r>
+      <w:r>
+        <w:rPr>
+          <w:rFonts w:ascii="Times New Roman" w:hAnsi="Times New Roman" w:cs="Times New Roman"/>
+          <w:sz w:val="28"/>
+          <w:szCs w:val="28"/>
+        </w:rPr>
+      </w:r>
+      <w:r>
+        <mc:AlternateContent>
+          <mc:Choice Requires="wpg">
+            <w:drawing>
+              <wp:inline xmlns:wp="http://schemas.openxmlformats.org/drawingml/2006/wordprocessingDrawing" distT="0" distB="0" distL="0" distR="0">
+                <wp:extent cx="6332220" cy="2103957"/>
+                <wp:effectExtent l="0" t="0" r="0" b="0"/>
+                <wp:docPr id="11" name=""/>
+                <wp:cNvGraphicFramePr>
+                  <a:graphicFrameLocks xmlns:a="http://schemas.openxmlformats.org/drawingml/2006/main" noChangeAspect="1"/>
+                </wp:cNvGraphicFramePr>
+                <a:graphic xmlns:a="http://schemas.openxmlformats.org/drawingml/2006/main">
+                  <a:graphicData uri="http://schemas.openxmlformats.org/drawingml/2006/picture">
+                    <pic:pic xmlns:pic="http://schemas.openxmlformats.org/drawingml/2006/picture">
+                      <pic:nvPicPr>
+                        <pic:cNvPr id="1841617684" name=""/>
+                        <pic:cNvPicPr>
+                          <a:picLocks noChangeAspect="1"/>
+                        </pic:cNvPicPr>
+                        <pic:nvPr/>
+                      </pic:nvPicPr>
+                      <pic:blipFill rotWithShape="1">
+                        <a:blip r:embed="rId20"/>
+                        <a:stretch/>
+                      </pic:blipFill>
+                      <pic:spPr bwMode="auto">
+                        <a:xfrm>
+                          <a:off x="0" y="0"/>
+                          <a:ext cx="6332220" cy="2103957"/>
+                        </a:xfrm>
+                        <a:prstGeom prst="rect">
+                          <a:avLst/>
+                        </a:prstGeom>
+                      </pic:spPr>
+                    </pic:pic>
+                  </a:graphicData>
+                </a:graphic>
+              </wp:inline>
+            </w:drawing>
+          </mc:Choice>
+          <mc:Fallback>
+            <w:pict>
+              <v:shapetype id="_x0000_t75" coordsize="21600,21600" o:spt="75" o:preferrelative="t" path="m@4@5l@4@11@9@11@9@5xe" filled="f" stroked="f">
+                <v:stroke joinstyle="miter"/>
+                <v:formulas>
+                  <v:f eqn="if lineDrawn pixelLineWidth 0"/>
+                  <v:f eqn="sum @0 1 0"/>
+                  <v:f eqn="sum 0 0 @1"/>
+                  <v:f eqn="prod @2 1 2"/>
+                  <v:f eqn="prod @3 21600 pixelWidth"/>
+                  <v:f eqn="prod @3 21600 pixelHeight"/>
+                  <v:f eqn="sum @0 0 1"/>
+                  <v:f eqn="prod @6 1 2"/>
+                  <v:f eqn="prod @7 21600 pixelWidth"/>
+                  <v:f eqn="sum @8 21600 0"/>
+                  <v:f eqn="prod @7 21600 pixelHeight"/>
+                  <v:f eqn="sum @10 21600 0"/>
+                </v:formulas>
+                <v:path o:extrusionok="f" gradientshapeok="t" o:connecttype="rect"/>
+                <o:lock v:ext="edit" aspectratio="t"/>
+              </v:shapetype>
+              <v:shape id="_x0000_i33" o:spid="_x0000_s33" type="#_x0000_t75" style="width:498.60pt;height:165.67pt;mso-wrap-distance-left:0.00pt;mso-wrap-distance-top:0.00pt;mso-wrap-distance-right:0.00pt;mso-wrap-distance-bottom:0.00pt;z-index:1;" stroked="false">
+                <v:imagedata r:id="rId20" o:title=""/>
+                <o:lock v:ext="edit" rotation="t"/>
+              </v:shape>
+            </w:pict>
+          </mc:Fallback>
+        </mc:AlternateContent>
+      </w:r>
+      <w:r>
+        <w:rPr>
+          <w:rFonts w:ascii="Times New Roman" w:hAnsi="Times New Roman" w:cs="Times New Roman"/>
+          <w:sz w:val="28"/>
+          <w:szCs w:val="28"/>
+        </w:rPr>
+      </w:r>
+      <w:r>
+        <w:rPr>
+          <w:rFonts w:ascii="Times New Roman" w:hAnsi="Times New Roman" w:cs="Times New Roman"/>
+          <w:sz w:val="28"/>
+          <w:szCs w:val="28"/>
+        </w:rPr>
+      </w:r>
+    </w:p>
+    <w:p>
+      <w:pPr>
+        <w:pStyle w:val="1301"/>
+        <w:pBdr/>
+        <w:spacing/>
+        <w:ind/>
+        <w:jc w:val="center"/>
+        <w:rPr>
+          <w:rFonts w:ascii="Times New Roman" w:hAnsi="Times New Roman" w:cs="Times New Roman"/>
+          <w:sz w:val="28"/>
+          <w:szCs w:val="28"/>
+        </w:rPr>
+      </w:pPr>
+      <w:r>
+        <w:rPr>
+          <w:rFonts w:ascii="Times New Roman" w:hAnsi="Times New Roman" w:cs="Times New Roman"/>
+          <w:sz w:val="28"/>
+          <w:szCs w:val="28"/>
+          <w:highlight w:val="none"/>
+          <w:lang w:val="uk-UA"/>
+        </w:rPr>
+        <w:t xml:space="preserve">Виявлення помилки на </w:t>
+      </w:r>
+      <w:r>
+        <w:rPr>
+          <w:rFonts w:ascii="Times New Roman" w:hAnsi="Times New Roman" w:cs="Times New Roman"/>
+          <w:sz w:val="28"/>
+          <w:szCs w:val="28"/>
+          <w:highlight w:val="none"/>
+          <w:lang w:val="en-US"/>
+        </w:rPr>
+        <w:t xml:space="preserve">CI</w:t>
+      </w:r>
+      <w:r>
+        <w:rPr>
+          <w:rFonts w:ascii="Times New Roman" w:hAnsi="Times New Roman" w:cs="Times New Roman"/>
+          <w:sz w:val="28"/>
+          <w:szCs w:val="28"/>
+          <w:highlight w:val="none"/>
+        </w:rPr>
+      </w:r>
+    </w:p>
+    <w:p>
+      <w:pPr>
+        <w:pStyle w:val="1301"/>
+        <w:pBdr/>
+        <w:spacing/>
+        <w:ind/>
+        <w:rPr>
+          <w:rFonts w:ascii="Times New Roman" w:hAnsi="Times New Roman" w:cs="Times New Roman"/>
+          <w:sz w:val="28"/>
+          <w:szCs w:val="28"/>
+        </w:rPr>
+      </w:pPr>
+      <w:r>
+        <w:rPr>
+          <w:rFonts w:ascii="Times New Roman" w:hAnsi="Times New Roman" w:cs="Times New Roman"/>
+          <w:sz w:val="28"/>
+          <w:szCs w:val="28"/>
+        </w:rPr>
+      </w:r>
+      <w:r>
+        <w:rPr>
+          <w:rFonts w:ascii="Times New Roman" w:hAnsi="Times New Roman" w:cs="Times New Roman"/>
+          <w:sz w:val="28"/>
+          <w:szCs w:val="28"/>
+        </w:rPr>
+      </w:r>
+      <w:r>
+        <w:rPr>
+          <w:rFonts w:ascii="Times New Roman" w:hAnsi="Times New Roman" w:cs="Times New Roman"/>
+          <w:sz w:val="28"/>
+          <w:szCs w:val="28"/>
+        </w:rPr>
+      </w:r>
+    </w:p>
+    <w:p>
+      <w:pPr>
+        <w:pStyle w:val="1301"/>
+        <w:pBdr/>
+        <w:spacing/>
+        <w:ind/>
+        <w:rPr>
+          <w:rFonts w:ascii="Times New Roman" w:hAnsi="Times New Roman" w:cs="Times New Roman"/>
+          <w:sz w:val="28"/>
+          <w:szCs w:val="28"/>
+        </w:rPr>
+      </w:pPr>
+      <w:r>
+        <w:rPr>
+          <w:rFonts w:ascii="Times New Roman" w:hAnsi="Times New Roman" w:cs="Times New Roman"/>
+          <w:sz w:val="28"/>
+          <w:szCs w:val="28"/>
+        </w:rPr>
+      </w:r>
+      <w:r>
+        <w:rPr>
+          <w:rFonts w:ascii="Times New Roman" w:hAnsi="Times New Roman" w:cs="Times New Roman"/>
+          <w:sz w:val="28"/>
+          <w:szCs w:val="28"/>
+        </w:rPr>
+      </w:r>
     </w:p>
     <w:p>
       <w:pPr>
@@ -2942,7 +3334,7 @@
               <wp:inline xmlns:wp="http://schemas.openxmlformats.org/drawingml/2006/wordprocessingDrawing" distT="0" distB="0" distL="0" distR="0">
                 <wp:extent cx="6000750" cy="2762250"/>
                 <wp:effectExtent l="0" t="0" r="0" b="0"/>
-                <wp:docPr id="10" name=""/>
+                <wp:docPr id="12" name=""/>
                 <wp:cNvGraphicFramePr>
                   <a:graphicFrameLocks xmlns:a="http://schemas.openxmlformats.org/drawingml/2006/main" noChangeAspect="1"/>
                 </wp:cNvGraphicFramePr>
@@ -2957,7 +3349,7 @@
                         <pic:nvPr/>
                       </pic:nvPicPr>
                       <pic:blipFill rotWithShape="1">
-                        <a:blip r:embed="rId19"/>
+                        <a:blip r:embed="rId21"/>
                         <a:stretch/>
                       </pic:blipFill>
                       <pic:spPr bwMode="auto">
@@ -2996,8 +3388,8 @@
                 <v:path o:extrusionok="f" gradientshapeok="t" o:connecttype="rect"/>
                 <o:lock v:ext="edit" aspectratio="t"/>
               </v:shapetype>
-              <v:shape id="_x0000_i32" o:spid="_x0000_s32" type="#_x0000_t75" style="width:472.50pt;height:217.50pt;mso-wrap-distance-left:0.00pt;mso-wrap-distance-top:0.00pt;mso-wrap-distance-right:0.00pt;mso-wrap-distance-bottom:0.00pt;z-index:1;" stroked="false">
-                <v:imagedata r:id="rId19" o:title=""/>
+              <v:shape id="_x0000_i34" o:spid="_x0000_s34" type="#_x0000_t75" style="width:472.50pt;height:217.50pt;mso-wrap-distance-left:0.00pt;mso-wrap-distance-top:0.00pt;mso-wrap-distance-right:0.00pt;mso-wrap-distance-bottom:0.00pt;z-index:1;" stroked="false">
+                <v:imagedata r:id="rId21" o:title=""/>
                 <o:lock v:ext="edit" rotation="t"/>
               </v:shape>
             </w:pict>
@@ -3143,7 +3535,7 @@
               <wp:inline xmlns:wp="http://schemas.openxmlformats.org/drawingml/2006/wordprocessingDrawing" distT="0" distB="0" distL="0" distR="0">
                 <wp:extent cx="6332220" cy="1313738"/>
                 <wp:effectExtent l="0" t="0" r="0" b="0"/>
-                <wp:docPr id="11" name=""/>
+                <wp:docPr id="13" name=""/>
                 <wp:cNvGraphicFramePr>
                   <a:graphicFrameLocks xmlns:a="http://schemas.openxmlformats.org/drawingml/2006/main" noChangeAspect="1"/>
                 </wp:cNvGraphicFramePr>
@@ -3158,7 +3550,7 @@
                         <pic:nvPr/>
                       </pic:nvPicPr>
                       <pic:blipFill rotWithShape="1">
-                        <a:blip r:embed="rId20"/>
+                        <a:blip r:embed="rId22"/>
                         <a:stretch/>
                       </pic:blipFill>
                       <pic:spPr bwMode="auto">
@@ -3197,8 +3589,8 @@
                 <v:path o:extrusionok="f" gradientshapeok="t" o:connecttype="rect"/>
                 <o:lock v:ext="edit" aspectratio="t"/>
               </v:shapetype>
-              <v:shape id="_x0000_i33" o:spid="_x0000_s33" type="#_x0000_t75" style="width:498.60pt;height:103.44pt;mso-wrap-distance-left:0.00pt;mso-wrap-distance-top:0.00pt;mso-wrap-distance-right:0.00pt;mso-wrap-distance-bottom:0.00pt;z-index:1;" stroked="false">
-                <v:imagedata r:id="rId20" o:title=""/>
+              <v:shape id="_x0000_i35" o:spid="_x0000_s35" type="#_x0000_t75" style="width:498.60pt;height:103.44pt;mso-wrap-distance-left:0.00pt;mso-wrap-distance-top:0.00pt;mso-wrap-distance-right:0.00pt;mso-wrap-distance-bottom:0.00pt;z-index:1;" stroked="false">
+                <v:imagedata r:id="rId22" o:title=""/>
                 <o:lock v:ext="edit" rotation="t"/>
               </v:shape>
             </w:pict>
@@ -3497,7 +3889,7 @@
               <wp:inline xmlns:wp="http://schemas.openxmlformats.org/drawingml/2006/wordprocessingDrawing" distT="0" distB="0" distL="0" distR="0">
                 <wp:extent cx="4729185" cy="4224739"/>
                 <wp:effectExtent l="0" t="0" r="0" b="0"/>
-                <wp:docPr id="12" name=""/>
+                <wp:docPr id="14" name=""/>
                 <wp:cNvGraphicFramePr>
                   <a:graphicFrameLocks xmlns:a="http://schemas.openxmlformats.org/drawingml/2006/main" noChangeAspect="1"/>
                 </wp:cNvGraphicFramePr>
@@ -3512,7 +3904,7 @@
                         <pic:nvPr/>
                       </pic:nvPicPr>
                       <pic:blipFill rotWithShape="1">
-                        <a:blip r:embed="rId21"/>
+                        <a:blip r:embed="rId23"/>
                         <a:stretch/>
                       </pic:blipFill>
                       <pic:spPr bwMode="auto">
@@ -3551,8 +3943,8 @@
                 <v:path o:extrusionok="f" gradientshapeok="t" o:connecttype="rect"/>
                 <o:lock v:ext="edit" aspectratio="t"/>
               </v:shapetype>
-              <v:shape id="_x0000_i34" o:spid="_x0000_s34" type="#_x0000_t75" style="width:372.38pt;height:332.66pt;mso-wrap-distance-left:0.00pt;mso-wrap-distance-top:0.00pt;mso-wrap-distance-right:0.00pt;mso-wrap-distance-bottom:0.00pt;z-index:1;" stroked="false">
-                <v:imagedata r:id="rId21" o:title=""/>
+              <v:shape id="_x0000_i36" o:spid="_x0000_s36" type="#_x0000_t75" style="width:372.38pt;height:332.66pt;mso-wrap-distance-left:0.00pt;mso-wrap-distance-top:0.00pt;mso-wrap-distance-right:0.00pt;mso-wrap-distance-bottom:0.00pt;z-index:1;" stroked="false">
+                <v:imagedata r:id="rId23" o:title=""/>
                 <o:lock v:ext="edit" rotation="t"/>
               </v:shape>
             </w:pict>

</xml_diff>

<commit_message>
Test failed healthcheck deploy
</commit_message>
<xml_diff>
--- a/pr6.docx
+++ b/pr6.docx
@@ -1919,173 +1919,6 @@
           <w:highlight w:val="none"/>
         </w:rPr>
       </w:r>
-    </w:p>
-    <w:p>
-      <w:pPr>
-        <w:pStyle w:val="1301"/>
-        <w:pBdr/>
-        <w:spacing/>
-        <w:ind/>
-        <w:rPr>
-          <w:rFonts w:ascii="Times New Roman" w:hAnsi="Times New Roman" w:eastAsia="Times New Roman" w:cs="Times New Roman"/>
-          <w:sz w:val="28"/>
-          <w:szCs w:val="28"/>
-          <w14:ligatures w14:val="none"/>
-        </w:rPr>
-      </w:pPr>
-      <w:r>
-        <w:rPr>
-          <w:rFonts w:ascii="Times New Roman" w:hAnsi="Times New Roman" w:eastAsia="Times New Roman" w:cs="Times New Roman"/>
-          <w:sz w:val="28"/>
-          <w:szCs w:val="28"/>
-        </w:rPr>
-      </w:r>
-      <w:r>
-        <w:rPr>
-          <w:rFonts w:ascii="Times New Roman" w:hAnsi="Times New Roman" w:eastAsia="Times New Roman" w:cs="Times New Roman"/>
-          <w:sz w:val="28"/>
-          <w:szCs w:val="28"/>
-        </w:rPr>
-      </w:r>
-    </w:p>
-    <w:p>
-      <w:pPr>
-        <w:pStyle w:val="1301"/>
-        <w:pBdr/>
-        <w:spacing/>
-        <w:ind/>
-        <w:rPr>
-          <w:rFonts w:ascii="Times New Roman" w:hAnsi="Times New Roman" w:eastAsia="Times New Roman" w:cs="Times New Roman"/>
-          <w:sz w:val="28"/>
-          <w:szCs w:val="28"/>
-          <w14:ligatures w14:val="none"/>
-        </w:rPr>
-      </w:pPr>
-      <w:r>
-        <w:rPr>
-          <w:rFonts w:ascii="Times New Roman" w:hAnsi="Times New Roman" w:eastAsia="Times New Roman" w:cs="Times New Roman"/>
-          <w:sz w:val="28"/>
-          <w:szCs w:val="28"/>
-          <w:highlight w:val="none"/>
-          <w:lang w:val="en-US"/>
-        </w:rPr>
-      </w:r>
-      <w:r>
-        <w:rPr>
-          <w:rFonts w:ascii="Times New Roman" w:hAnsi="Times New Roman" w:eastAsia="Times New Roman" w:cs="Times New Roman"/>
-          <w:sz w:val="28"/>
-          <w:szCs w:val="28"/>
-          <w:highlight w:val="none"/>
-          <w:lang w:val="en-US"/>
-        </w:rPr>
-      </w:r>
-      <w:r>
-        <w:rPr>
-          <w:rFonts w:ascii="Times New Roman" w:hAnsi="Times New Roman" w:eastAsia="Times New Roman" w:cs="Times New Roman"/>
-          <w:sz w:val="28"/>
-          <w:szCs w:val="28"/>
-          <w:highlight w:val="none"/>
-          <w:lang w:val="en-US"/>
-        </w:rPr>
-      </w:r>
-    </w:p>
-    <w:p>
-      <w:pPr>
-        <w:pStyle w:val="1301"/>
-        <w:pBdr/>
-        <w:spacing/>
-        <w:ind/>
-        <w:jc w:val="center"/>
-        <w:rPr>
-          <w:rFonts w:ascii="Times New Roman" w:hAnsi="Times New Roman" w:cs="Times New Roman"/>
-          <w:sz w:val="28"/>
-          <w:szCs w:val="28"/>
-        </w:rPr>
-      </w:pPr>
-      <w:r>
-        <w:rPr>
-          <w:rFonts w:ascii="Times New Roman" w:hAnsi="Times New Roman" w:cs="Times New Roman"/>
-          <w:sz w:val="28"/>
-          <w:szCs w:val="28"/>
-        </w:rPr>
-      </w:r>
-      <w:r>
-        <mc:AlternateContent>
-          <mc:Choice Requires="wpg">
-            <w:drawing>
-              <wp:inline xmlns:wp="http://schemas.openxmlformats.org/drawingml/2006/wordprocessingDrawing" distT="0" distB="0" distL="0" distR="0">
-                <wp:extent cx="6332220" cy="2466390"/>
-                <wp:effectExtent l="0" t="0" r="0" b="0"/>
-                <wp:docPr id="7" name=""/>
-                <wp:cNvGraphicFramePr>
-                  <a:graphicFrameLocks xmlns:a="http://schemas.openxmlformats.org/drawingml/2006/main" noChangeAspect="1"/>
-                </wp:cNvGraphicFramePr>
-                <a:graphic xmlns:a="http://schemas.openxmlformats.org/drawingml/2006/main">
-                  <a:graphicData uri="http://schemas.openxmlformats.org/drawingml/2006/picture">
-                    <pic:pic xmlns:pic="http://schemas.openxmlformats.org/drawingml/2006/picture">
-                      <pic:nvPicPr>
-                        <pic:cNvPr id="66873683" name=""/>
-                        <pic:cNvPicPr>
-                          <a:picLocks noChangeAspect="1"/>
-                        </pic:cNvPicPr>
-                        <pic:nvPr/>
-                      </pic:nvPicPr>
-                      <pic:blipFill rotWithShape="1">
-                        <a:blip r:embed="rId16"/>
-                        <a:stretch/>
-                      </pic:blipFill>
-                      <pic:spPr bwMode="auto">
-                        <a:xfrm>
-                          <a:off x="0" y="0"/>
-                          <a:ext cx="6332220" cy="2466389"/>
-                        </a:xfrm>
-                        <a:prstGeom prst="rect">
-                          <a:avLst/>
-                        </a:prstGeom>
-                      </pic:spPr>
-                    </pic:pic>
-                  </a:graphicData>
-                </a:graphic>
-              </wp:inline>
-            </w:drawing>
-          </mc:Choice>
-          <mc:Fallback>
-            <w:pict>
-              <v:shapetype id="_x0000_t75" coordsize="21600,21600" o:spt="75" o:preferrelative="t" path="m@4@5l@4@11@9@11@9@5xe" filled="f" stroked="f">
-                <v:stroke joinstyle="miter"/>
-                <v:formulas>
-                  <v:f eqn="if lineDrawn pixelLineWidth 0"/>
-                  <v:f eqn="sum @0 1 0"/>
-                  <v:f eqn="sum 0 0 @1"/>
-                  <v:f eqn="prod @2 1 2"/>
-                  <v:f eqn="prod @3 21600 pixelWidth"/>
-                  <v:f eqn="prod @3 21600 pixelHeight"/>
-                  <v:f eqn="sum @0 0 1"/>
-                  <v:f eqn="prod @6 1 2"/>
-                  <v:f eqn="prod @7 21600 pixelWidth"/>
-                  <v:f eqn="sum @8 21600 0"/>
-                  <v:f eqn="prod @7 21600 pixelHeight"/>
-                  <v:f eqn="sum @10 21600 0"/>
-                </v:formulas>
-                <v:path o:extrusionok="f" gradientshapeok="t" o:connecttype="rect"/>
-                <o:lock v:ext="edit" aspectratio="t"/>
-              </v:shapetype>
-              <v:shape id="_x0000_i29" o:spid="_x0000_s29" type="#_x0000_t75" style="width:498.60pt;height:194.20pt;mso-wrap-distance-left:0.00pt;mso-wrap-distance-top:0.00pt;mso-wrap-distance-right:0.00pt;mso-wrap-distance-bottom:0.00pt;z-index:1;" stroked="false">
-                <v:imagedata r:id="rId16" o:title=""/>
-                <o:lock v:ext="edit" rotation="t"/>
-              </v:shape>
-            </w:pict>
-          </mc:Fallback>
-        </mc:AlternateContent>
-      </w:r>
-      <w:r>
-        <w:rPr>
-          <w:rFonts w:ascii="Times New Roman" w:hAnsi="Times New Roman" w:cs="Times New Roman"/>
-          <w:sz w:val="28"/>
-          <w:szCs w:val="28"/>
-        </w:rPr>
-      </w:r>
-      <w:r/>
       <w:r>
         <w:rPr>
           <w:rFonts w:ascii="Times New Roman" w:hAnsi="Times New Roman" w:cs="Times New Roman"/>
@@ -2100,20 +1933,6 @@
           <w:szCs w:val="28"/>
         </w:rPr>
       </w:r>
-    </w:p>
-    <w:p>
-      <w:pPr>
-        <w:pStyle w:val="1301"/>
-        <w:pBdr/>
-        <w:spacing/>
-        <w:ind/>
-        <w:jc w:val="center"/>
-        <w:rPr>
-          <w:rFonts w:ascii="Times New Roman" w:hAnsi="Times New Roman" w:cs="Times New Roman"/>
-          <w:sz w:val="28"/>
-          <w:szCs w:val="28"/>
-        </w:rPr>
-      </w:pPr>
       <w:r>
         <w:rPr>
           <w:rFonts w:ascii="Times New Roman" w:hAnsi="Times New Roman" w:cs="Times New Roman"/>
@@ -2123,70 +1942,7 @@
       </w:r>
       <w:r>
         <w:rPr>
-          <w:rFonts w:ascii="Times New Roman" w:hAnsi="Times New Roman" w:cs="Times New Roman"/>
-          <w:sz w:val="28"/>
-          <w:szCs w:val="28"/>
-          <w:lang w:val="uk-UA"/>
-        </w:rPr>
-        <w:t xml:space="preserve">Рис. </w:t>
-      </w:r>
-      <w:r>
-        <w:rPr>
-          <w:rFonts w:ascii="Times New Roman" w:hAnsi="Times New Roman" w:cs="Times New Roman"/>
-          <w:sz w:val="28"/>
-          <w:szCs w:val="28"/>
-          <w:lang w:val="en-US"/>
-        </w:rPr>
-        <w:t xml:space="preserve">6</w:t>
-      </w:r>
-      <w:r>
-        <w:rPr>
-          <w:rFonts w:ascii="Times New Roman" w:hAnsi="Times New Roman" w:cs="Times New Roman"/>
-          <w:sz w:val="28"/>
-          <w:szCs w:val="28"/>
-          <w:lang w:val="uk-UA"/>
-        </w:rPr>
-        <w:t xml:space="preserve">.</w:t>
-      </w:r>
-      <w:r>
-        <w:rPr>
-          <w:rFonts w:ascii="Times New Roman" w:hAnsi="Times New Roman" w:cs="Times New Roman"/>
-          <w:sz w:val="28"/>
-          <w:szCs w:val="28"/>
-          <w:lang w:val="en-US"/>
-        </w:rPr>
-        <w:t xml:space="preserve">4</w:t>
-      </w:r>
-      <w:r>
-        <w:rPr>
-          <w:rFonts w:ascii="Times New Roman" w:hAnsi="Times New Roman" w:cs="Times New Roman"/>
-          <w:sz w:val="28"/>
-          <w:szCs w:val="28"/>
-          <w:lang w:val="uk-UA"/>
-        </w:rPr>
-        <w:t xml:space="preserve"> – </w:t>
-      </w:r>
-      <w:r>
-        <w:rPr>
-          <w:rFonts w:ascii="Times New Roman" w:hAnsi="Times New Roman" w:cs="Times New Roman"/>
-          <w:sz w:val="28"/>
-          <w:szCs w:val="28"/>
-          <w:lang w:val="uk-UA"/>
-        </w:rPr>
-        <w:t xml:space="preserve">Налаштування </w:t>
-      </w:r>
-      <w:r>
-        <w:rPr>
-          <w:rFonts w:ascii="Times New Roman" w:hAnsi="Times New Roman" w:cs="Times New Roman"/>
-          <w:sz w:val="28"/>
-          <w:szCs w:val="28"/>
-          <w:lang w:val="en-US"/>
-        </w:rPr>
-        <w:t xml:space="preserve">fly-deploy</w:t>
-      </w:r>
-      <w:r>
-        <w:rPr>
-          <w:rFonts w:ascii="Times New Roman" w:hAnsi="Times New Roman" w:cs="Times New Roman"/>
+          <w:rFonts w:ascii="Times New Roman" w:hAnsi="Times New Roman" w:eastAsia="Times New Roman" w:cs="Times New Roman"/>
           <w:sz w:val="28"/>
           <w:szCs w:val="28"/>
         </w:rPr>
@@ -2232,40 +1988,6 @@
         <w:pBdr/>
         <w:spacing/>
         <w:ind/>
-        <w:rPr>
-          <w:rFonts w:ascii="Times New Roman" w:hAnsi="Times New Roman" w:cs="Times New Roman"/>
-          <w:sz w:val="28"/>
-          <w:szCs w:val="28"/>
-        </w:rPr>
-      </w:pPr>
-      <w:r>
-        <w:rPr>
-          <w:rFonts w:ascii="Times New Roman" w:hAnsi="Times New Roman" w:cs="Times New Roman"/>
-          <w:sz w:val="28"/>
-          <w:szCs w:val="28"/>
-        </w:rPr>
-      </w:r>
-      <w:r>
-        <w:rPr>
-          <w:rFonts w:ascii="Times New Roman" w:hAnsi="Times New Roman" w:cs="Times New Roman"/>
-          <w:sz w:val="28"/>
-          <w:szCs w:val="28"/>
-        </w:rPr>
-      </w:r>
-      <w:r>
-        <w:rPr>
-          <w:rFonts w:ascii="Times New Roman" w:hAnsi="Times New Roman" w:cs="Times New Roman"/>
-          <w:sz w:val="28"/>
-          <w:szCs w:val="28"/>
-        </w:rPr>
-      </w:r>
-    </w:p>
-    <w:p>
-      <w:pPr>
-        <w:pStyle w:val="1301"/>
-        <w:pBdr/>
-        <w:spacing/>
-        <w:ind/>
         <w:jc w:val="center"/>
         <w:rPr>
           <w:rFonts w:ascii="Times New Roman" w:hAnsi="Times New Roman" w:cs="Times New Roman"/>
@@ -2287,7 +2009,7 @@
               <wp:inline xmlns:wp="http://schemas.openxmlformats.org/drawingml/2006/wordprocessingDrawing" distT="0" distB="0" distL="0" distR="0">
                 <wp:extent cx="6332220" cy="2126542"/>
                 <wp:effectExtent l="0" t="0" r="0" b="0"/>
-                <wp:docPr id="8" name=""/>
+                <wp:docPr id="7" name=""/>
                 <wp:cNvGraphicFramePr>
                   <a:graphicFrameLocks xmlns:a="http://schemas.openxmlformats.org/drawingml/2006/main" noChangeAspect="1"/>
                 </wp:cNvGraphicFramePr>
@@ -2302,7 +2024,7 @@
                         <pic:nvPr/>
                       </pic:nvPicPr>
                       <pic:blipFill rotWithShape="1">
-                        <a:blip r:embed="rId17"/>
+                        <a:blip r:embed="rId16"/>
                         <a:stretch/>
                       </pic:blipFill>
                       <pic:spPr bwMode="auto">
@@ -2341,8 +2063,8 @@
                 <v:path o:extrusionok="f" gradientshapeok="t" o:connecttype="rect"/>
                 <o:lock v:ext="edit" aspectratio="t"/>
               </v:shapetype>
-              <v:shape id="_x0000_i30" o:spid="_x0000_s30" type="#_x0000_t75" style="width:498.60pt;height:167.44pt;mso-wrap-distance-left:0.00pt;mso-wrap-distance-top:0.00pt;mso-wrap-distance-right:0.00pt;mso-wrap-distance-bottom:0.00pt;z-index:1;" stroked="false">
-                <v:imagedata r:id="rId17" o:title=""/>
+              <v:shape id="_x0000_i29" o:spid="_x0000_s29" type="#_x0000_t75" style="width:498.60pt;height:167.44pt;mso-wrap-distance-left:0.00pt;mso-wrap-distance-top:0.00pt;mso-wrap-distance-right:0.00pt;mso-wrap-distance-bottom:0.00pt;z-index:1;" stroked="false">
+                <v:imagedata r:id="rId16" o:title=""/>
                 <o:lock v:ext="edit" rotation="t"/>
               </v:shape>
             </w:pict>
@@ -2541,7 +2263,7 @@
               <wp:inline xmlns:wp="http://schemas.openxmlformats.org/drawingml/2006/wordprocessingDrawing" distT="0" distB="0" distL="0" distR="0">
                 <wp:extent cx="6332220" cy="2226118"/>
                 <wp:effectExtent l="0" t="0" r="0" b="0"/>
-                <wp:docPr id="9" name=""/>
+                <wp:docPr id="8" name=""/>
                 <wp:cNvGraphicFramePr>
                   <a:graphicFrameLocks xmlns:a="http://schemas.openxmlformats.org/drawingml/2006/main" noChangeAspect="1"/>
                 </wp:cNvGraphicFramePr>
@@ -2556,7 +2278,7 @@
                         <pic:nvPr/>
                       </pic:nvPicPr>
                       <pic:blipFill rotWithShape="1">
-                        <a:blip r:embed="rId18"/>
+                        <a:blip r:embed="rId17"/>
                         <a:stretch/>
                       </pic:blipFill>
                       <pic:spPr bwMode="auto">
@@ -2595,8 +2317,8 @@
                 <v:path o:extrusionok="f" gradientshapeok="t" o:connecttype="rect"/>
                 <o:lock v:ext="edit" aspectratio="t"/>
               </v:shapetype>
-              <v:shape id="_x0000_i31" o:spid="_x0000_s31" type="#_x0000_t75" style="width:498.60pt;height:175.28pt;mso-wrap-distance-left:0.00pt;mso-wrap-distance-top:0.00pt;mso-wrap-distance-right:0.00pt;mso-wrap-distance-bottom:0.00pt;z-index:1;" stroked="false">
-                <v:imagedata r:id="rId18" o:title=""/>
+              <v:shape id="_x0000_i30" o:spid="_x0000_s30" type="#_x0000_t75" style="width:498.60pt;height:175.28pt;mso-wrap-distance-left:0.00pt;mso-wrap-distance-top:0.00pt;mso-wrap-distance-right:0.00pt;mso-wrap-distance-bottom:0.00pt;z-index:1;" stroked="false">
+                <v:imagedata r:id="rId17" o:title=""/>
                 <o:lock v:ext="edit" rotation="t"/>
               </v:shape>
             </w:pict>
@@ -2753,7 +2475,7 @@
               <wp:inline xmlns:wp="http://schemas.openxmlformats.org/drawingml/2006/wordprocessingDrawing" distT="0" distB="0" distL="0" distR="0">
                 <wp:extent cx="6332220" cy="1154933"/>
                 <wp:effectExtent l="0" t="0" r="0" b="0"/>
-                <wp:docPr id="10" name=""/>
+                <wp:docPr id="9" name=""/>
                 <wp:cNvGraphicFramePr>
                   <a:graphicFrameLocks xmlns:a="http://schemas.openxmlformats.org/drawingml/2006/main" noChangeAspect="1"/>
                 </wp:cNvGraphicFramePr>
@@ -2768,7 +2490,7 @@
                         <pic:nvPr/>
                       </pic:nvPicPr>
                       <pic:blipFill rotWithShape="1">
-                        <a:blip r:embed="rId19"/>
+                        <a:blip r:embed="rId18"/>
                         <a:stretch/>
                       </pic:blipFill>
                       <pic:spPr bwMode="auto">
@@ -2807,8 +2529,8 @@
                 <v:path o:extrusionok="f" gradientshapeok="t" o:connecttype="rect"/>
                 <o:lock v:ext="edit" aspectratio="t"/>
               </v:shapetype>
-              <v:shape id="_x0000_i32" o:spid="_x0000_s32" type="#_x0000_t75" style="width:498.60pt;height:90.94pt;mso-wrap-distance-left:0.00pt;mso-wrap-distance-top:0.00pt;mso-wrap-distance-right:0.00pt;mso-wrap-distance-bottom:0.00pt;z-index:1;" stroked="false">
-                <v:imagedata r:id="rId19" o:title=""/>
+              <v:shape id="_x0000_i31" o:spid="_x0000_s31" type="#_x0000_t75" style="width:498.60pt;height:90.94pt;mso-wrap-distance-left:0.00pt;mso-wrap-distance-top:0.00pt;mso-wrap-distance-right:0.00pt;mso-wrap-distance-bottom:0.00pt;z-index:1;" stroked="false">
+                <v:imagedata r:id="rId18" o:title=""/>
                 <o:lock v:ext="edit" rotation="t"/>
               </v:shape>
             </w:pict>
@@ -2931,7 +2653,7 @@
               <wp:inline xmlns:wp="http://schemas.openxmlformats.org/drawingml/2006/wordprocessingDrawing" distT="0" distB="0" distL="0" distR="0">
                 <wp:extent cx="6332220" cy="2103957"/>
                 <wp:effectExtent l="0" t="0" r="0" b="0"/>
-                <wp:docPr id="11" name=""/>
+                <wp:docPr id="10" name=""/>
                 <wp:cNvGraphicFramePr>
                   <a:graphicFrameLocks xmlns:a="http://schemas.openxmlformats.org/drawingml/2006/main" noChangeAspect="1"/>
                 </wp:cNvGraphicFramePr>
@@ -2946,7 +2668,7 @@
                         <pic:nvPr/>
                       </pic:nvPicPr>
                       <pic:blipFill rotWithShape="1">
-                        <a:blip r:embed="rId20"/>
+                        <a:blip r:embed="rId19"/>
                         <a:stretch/>
                       </pic:blipFill>
                       <pic:spPr bwMode="auto">
@@ -2985,8 +2707,8 @@
                 <v:path o:extrusionok="f" gradientshapeok="t" o:connecttype="rect"/>
                 <o:lock v:ext="edit" aspectratio="t"/>
               </v:shapetype>
-              <v:shape id="_x0000_i33" o:spid="_x0000_s33" type="#_x0000_t75" style="width:498.60pt;height:165.67pt;mso-wrap-distance-left:0.00pt;mso-wrap-distance-top:0.00pt;mso-wrap-distance-right:0.00pt;mso-wrap-distance-bottom:0.00pt;z-index:1;" stroked="false">
-                <v:imagedata r:id="rId20" o:title=""/>
+              <v:shape id="_x0000_i32" o:spid="_x0000_s32" type="#_x0000_t75" style="width:498.60pt;height:165.67pt;mso-wrap-distance-left:0.00pt;mso-wrap-distance-top:0.00pt;mso-wrap-distance-right:0.00pt;mso-wrap-distance-bottom:0.00pt;z-index:1;" stroked="false">
+                <v:imagedata r:id="rId19" o:title=""/>
                 <o:lock v:ext="edit" rotation="t"/>
               </v:shape>
             </w:pict>
@@ -3170,6 +2892,82 @@
         <w:ind/>
         <w:rPr>
           <w:rFonts w:ascii="Times New Roman" w:hAnsi="Times New Roman" w:cs="Times New Roman"/>
+          <w:sz w:val="40"/>
+          <w:szCs w:val="40"/>
+        </w:rPr>
+      </w:pPr>
+      <w:r>
+        <w:rPr>
+          <w:rFonts w:ascii="Times New Roman" w:hAnsi="Times New Roman" w:eastAsia="Times New Roman" w:cs="Times New Roman"/>
+          <w:sz w:val="40"/>
+          <w:szCs w:val="40"/>
+        </w:rPr>
+      </w:r>
+      <w:r>
+        <w:rPr>
+          <w:rFonts w:ascii="Times New Roman" w:hAnsi="Times New Roman" w:eastAsia="Times New Roman" w:cs="Times New Roman"/>
+          <w:sz w:val="28"/>
+          <w:szCs w:val="28"/>
+        </w:rPr>
+        <w:t xml:space="preserve">Автоматичний деплой зі стадії deploy</w:t>
+      </w:r>
+      <w:r>
+        <w:rPr>
+          <w:rFonts w:ascii="Times New Roman" w:hAnsi="Times New Roman" w:eastAsia="Times New Roman" w:cs="Times New Roman"/>
+          <w:sz w:val="40"/>
+          <w:szCs w:val="40"/>
+        </w:rPr>
+      </w:r>
+      <w:r>
+        <w:rPr>
+          <w:rFonts w:ascii="Times New Roman" w:hAnsi="Times New Roman" w:eastAsia="Times New Roman" w:cs="Times New Roman"/>
+          <w:sz w:val="40"/>
+          <w:szCs w:val="40"/>
+        </w:rPr>
+      </w:r>
+    </w:p>
+    <w:p>
+      <w:pPr>
+        <w:pStyle w:val="1301"/>
+        <w:pBdr/>
+        <w:spacing/>
+        <w:ind/>
+        <w:rPr>
+          <w:rFonts w:ascii="Times New Roman" w:hAnsi="Times New Roman" w:cs="Times New Roman"/>
+          <w:sz w:val="28"/>
+          <w:szCs w:val="28"/>
+        </w:rPr>
+      </w:pPr>
+      <w:r>
+        <w:rPr>
+          <w:rFonts w:ascii="Times New Roman" w:hAnsi="Times New Roman" w:cs="Times New Roman"/>
+          <w:sz w:val="28"/>
+          <w:szCs w:val="28"/>
+        </w:rPr>
+      </w:r>
+      <w:r>
+        <w:rPr>
+          <w:rFonts w:ascii="Times New Roman" w:hAnsi="Times New Roman" w:cs="Times New Roman"/>
+          <w:sz w:val="28"/>
+          <w:szCs w:val="28"/>
+        </w:rPr>
+      </w:r>
+      <w:r>
+        <w:rPr>
+          <w:rFonts w:ascii="Times New Roman" w:hAnsi="Times New Roman" w:cs="Times New Roman"/>
+          <w:sz w:val="28"/>
+          <w:szCs w:val="28"/>
+        </w:rPr>
+      </w:r>
+    </w:p>
+    <w:p>
+      <w:pPr>
+        <w:pStyle w:val="1301"/>
+        <w:pBdr/>
+        <w:spacing/>
+        <w:ind/>
+        <w:rPr>
+          <w:rFonts w:ascii="Times New Roman" w:hAnsi="Times New Roman" w:cs="Times New Roman"/>
           <w:sz w:val="36"/>
           <w:szCs w:val="36"/>
         </w:rPr>
@@ -3187,7 +2985,7 @@
           <w:sz w:val="28"/>
           <w:szCs w:val="28"/>
         </w:rPr>
-        <w:t xml:space="preserve">Healthcheck у fly.toml</w:t>
+        <w:t xml:space="preserve">Розширте конвеєр стадією deploy, яка автоматично розгортає застосунок на fly.io.</w:t>
       </w:r>
       <w:r>
         <w:rPr>
@@ -3201,6 +2999,501 @@
           <w:rFonts w:ascii="Times New Roman" w:hAnsi="Times New Roman" w:eastAsia="Times New Roman" w:cs="Times New Roman"/>
           <w:sz w:val="36"/>
           <w:szCs w:val="36"/>
+        </w:rPr>
+      </w:r>
+    </w:p>
+    <w:p>
+      <w:pPr>
+        <w:pStyle w:val="1301"/>
+        <w:pBdr/>
+        <w:spacing/>
+        <w:ind/>
+        <w:rPr>
+          <w:rFonts w:ascii="Times New Roman" w:hAnsi="Times New Roman" w:cs="Times New Roman"/>
+          <w:sz w:val="28"/>
+          <w:szCs w:val="28"/>
+        </w:rPr>
+      </w:pPr>
+      <w:r>
+        <w:rPr>
+          <w:rFonts w:ascii="Times New Roman" w:hAnsi="Times New Roman" w:cs="Times New Roman"/>
+          <w:sz w:val="28"/>
+          <w:szCs w:val="28"/>
+        </w:rPr>
+      </w:r>
+      <w:r>
+        <w:rPr>
+          <w:rFonts w:ascii="Times New Roman" w:hAnsi="Times New Roman" w:cs="Times New Roman"/>
+          <w:sz w:val="28"/>
+          <w:szCs w:val="28"/>
+        </w:rPr>
+      </w:r>
+      <w:r>
+        <w:rPr>
+          <w:rFonts w:ascii="Times New Roman" w:hAnsi="Times New Roman" w:cs="Times New Roman"/>
+          <w:sz w:val="28"/>
+          <w:szCs w:val="28"/>
+        </w:rPr>
+      </w:r>
+    </w:p>
+    <w:p>
+      <w:pPr>
+        <w:pStyle w:val="1301"/>
+        <w:pBdr/>
+        <w:spacing/>
+        <w:ind/>
+        <w:rPr>
+          <w:rFonts w:ascii="Times New Roman" w:hAnsi="Times New Roman" w:cs="Times New Roman"/>
+          <w:sz w:val="28"/>
+          <w:szCs w:val="28"/>
+        </w:rPr>
+      </w:pPr>
+      <w:r>
+        <w:rPr>
+          <w:rFonts w:ascii="Times New Roman" w:hAnsi="Times New Roman" w:cs="Times New Roman"/>
+          <w:sz w:val="28"/>
+          <w:szCs w:val="28"/>
+        </w:rPr>
+      </w:r>
+      <w:r>
+        <w:rPr>
+          <w:rFonts w:ascii="Times New Roman" w:hAnsi="Times New Roman" w:cs="Times New Roman"/>
+          <w:sz w:val="28"/>
+          <w:szCs w:val="28"/>
+        </w:rPr>
+      </w:r>
+      <w:r>
+        <w:rPr>
+          <w:rFonts w:ascii="Times New Roman" w:hAnsi="Times New Roman" w:cs="Times New Roman"/>
+          <w:sz w:val="28"/>
+          <w:szCs w:val="28"/>
+        </w:rPr>
+      </w:r>
+    </w:p>
+    <w:p>
+      <w:pPr>
+        <w:pStyle w:val="1301"/>
+        <w:pBdr/>
+        <w:spacing/>
+        <w:ind/>
+        <w:rPr>
+          <w:rFonts w:ascii="Times New Roman" w:hAnsi="Times New Roman" w:cs="Times New Roman"/>
+          <w:sz w:val="28"/>
+          <w:szCs w:val="28"/>
+        </w:rPr>
+      </w:pPr>
+      <w:r>
+        <w:rPr>
+          <w:rFonts w:ascii="Times New Roman" w:hAnsi="Times New Roman" w:cs="Times New Roman"/>
+          <w:sz w:val="28"/>
+          <w:szCs w:val="28"/>
+        </w:rPr>
+      </w:r>
+      <w:r>
+        <w:rPr>
+          <w:rFonts w:ascii="Times New Roman" w:hAnsi="Times New Roman" w:cs="Times New Roman"/>
+          <w:sz w:val="28"/>
+          <w:szCs w:val="28"/>
+        </w:rPr>
+      </w:r>
+      <w:r>
+        <w:rPr>
+          <w:rFonts w:ascii="Times New Roman" w:hAnsi="Times New Roman" w:cs="Times New Roman"/>
+          <w:sz w:val="28"/>
+          <w:szCs w:val="28"/>
+        </w:rPr>
+      </w:r>
+    </w:p>
+    <w:p>
+      <w:pPr>
+        <w:pStyle w:val="1301"/>
+        <w:pBdr/>
+        <w:spacing/>
+        <w:ind/>
+        <w:rPr>
+          <w:rFonts w:ascii="Times New Roman" w:hAnsi="Times New Roman" w:cs="Times New Roman"/>
+          <w:sz w:val="28"/>
+          <w:szCs w:val="28"/>
+        </w:rPr>
+      </w:pPr>
+      <w:r>
+        <w:rPr>
+          <w:rFonts w:ascii="Times New Roman" w:hAnsi="Times New Roman" w:cs="Times New Roman"/>
+          <w:sz w:val="28"/>
+          <w:szCs w:val="28"/>
+        </w:rPr>
+      </w:r>
+      <w:r>
+        <w:rPr>
+          <w:rFonts w:ascii="Times New Roman" w:hAnsi="Times New Roman" w:cs="Times New Roman"/>
+          <w:sz w:val="28"/>
+          <w:szCs w:val="28"/>
+        </w:rPr>
+      </w:r>
+      <w:r>
+        <w:rPr>
+          <w:rFonts w:ascii="Times New Roman" w:hAnsi="Times New Roman" w:cs="Times New Roman"/>
+          <w:sz w:val="28"/>
+          <w:szCs w:val="28"/>
+        </w:rPr>
+      </w:r>
+    </w:p>
+    <w:p>
+      <w:pPr>
+        <w:pStyle w:val="1301"/>
+        <w:pBdr/>
+        <w:spacing/>
+        <w:ind/>
+        <w:rPr>
+          <w:rFonts w:ascii="Times New Roman" w:hAnsi="Times New Roman" w:eastAsia="Times New Roman" w:cs="Times New Roman"/>
+          <w:sz w:val="28"/>
+          <w:szCs w:val="28"/>
+          <w14:ligatures w14:val="none"/>
+        </w:rPr>
+      </w:pPr>
+      <w:r>
+        <w:rPr>
+          <w:rFonts w:ascii="Times New Roman" w:hAnsi="Times New Roman" w:eastAsia="Times New Roman" w:cs="Times New Roman"/>
+          <w:sz w:val="28"/>
+          <w:szCs w:val="28"/>
+          <w:highlight w:val="none"/>
+          <w:lang w:val="en-US"/>
+        </w:rPr>
+      </w:r>
+      <w:r>
+        <w:rPr>
+          <w:rFonts w:ascii="Times New Roman" w:hAnsi="Times New Roman" w:eastAsia="Times New Roman" w:cs="Times New Roman"/>
+          <w:sz w:val="28"/>
+          <w:szCs w:val="28"/>
+          <w14:ligatures w14:val="none"/>
+        </w:rPr>
+      </w:r>
+      <w:r>
+        <w:rPr>
+          <w:rFonts w:ascii="Times New Roman" w:hAnsi="Times New Roman" w:eastAsia="Times New Roman" w:cs="Times New Roman"/>
+          <w:sz w:val="28"/>
+          <w:szCs w:val="28"/>
+          <w14:ligatures w14:val="none"/>
+        </w:rPr>
+      </w:r>
+    </w:p>
+    <w:p>
+      <w:pPr>
+        <w:pStyle w:val="1301"/>
+        <w:pBdr/>
+        <w:spacing/>
+        <w:ind/>
+        <w:jc w:val="center"/>
+        <w:rPr>
+          <w:rFonts w:ascii="Times New Roman" w:hAnsi="Times New Roman" w:cs="Times New Roman"/>
+          <w:sz w:val="28"/>
+          <w:szCs w:val="28"/>
+        </w:rPr>
+      </w:pPr>
+      <w:r>
+        <w:rPr>
+          <w:rFonts w:ascii="Times New Roman" w:hAnsi="Times New Roman" w:cs="Times New Roman"/>
+          <w:sz w:val="28"/>
+          <w:szCs w:val="28"/>
+        </w:rPr>
+      </w:r>
+      <w:r>
+        <mc:AlternateContent>
+          <mc:Choice Requires="wpg">
+            <w:drawing>
+              <wp:inline xmlns:wp="http://schemas.openxmlformats.org/drawingml/2006/wordprocessingDrawing" distT="0" distB="0" distL="0" distR="0">
+                <wp:extent cx="6332220" cy="2466390"/>
+                <wp:effectExtent l="0" t="0" r="0" b="0"/>
+                <wp:docPr id="11" name=""/>
+                <wp:cNvGraphicFramePr>
+                  <a:graphicFrameLocks xmlns:a="http://schemas.openxmlformats.org/drawingml/2006/main" noChangeAspect="1"/>
+                </wp:cNvGraphicFramePr>
+                <a:graphic xmlns:a="http://schemas.openxmlformats.org/drawingml/2006/main">
+                  <a:graphicData uri="http://schemas.openxmlformats.org/drawingml/2006/picture">
+                    <pic:pic xmlns:pic="http://schemas.openxmlformats.org/drawingml/2006/picture">
+                      <pic:nvPicPr>
+                        <pic:cNvPr id="1319665646" name=""/>
+                        <pic:cNvPicPr>
+                          <a:picLocks noChangeAspect="1"/>
+                        </pic:cNvPicPr>
+                        <pic:nvPr/>
+                      </pic:nvPicPr>
+                      <pic:blipFill rotWithShape="1">
+                        <a:blip r:embed="rId20"/>
+                        <a:stretch/>
+                      </pic:blipFill>
+                      <pic:spPr bwMode="auto">
+                        <a:xfrm>
+                          <a:off x="0" y="0"/>
+                          <a:ext cx="6332218" cy="2466388"/>
+                        </a:xfrm>
+                        <a:prstGeom prst="rect">
+                          <a:avLst/>
+                        </a:prstGeom>
+                      </pic:spPr>
+                    </pic:pic>
+                  </a:graphicData>
+                </a:graphic>
+              </wp:inline>
+            </w:drawing>
+          </mc:Choice>
+          <mc:Fallback>
+            <w:pict>
+              <v:shapetype id="_x0000_t75" coordsize="21600,21600" o:spt="75" o:preferrelative="t" path="m@4@5l@4@11@9@11@9@5xe" filled="f" stroked="f">
+                <v:stroke joinstyle="miter"/>
+                <v:formulas>
+                  <v:f eqn="if lineDrawn pixelLineWidth 0"/>
+                  <v:f eqn="sum @0 1 0"/>
+                  <v:f eqn="sum 0 0 @1"/>
+                  <v:f eqn="prod @2 1 2"/>
+                  <v:f eqn="prod @3 21600 pixelWidth"/>
+                  <v:f eqn="prod @3 21600 pixelHeight"/>
+                  <v:f eqn="sum @0 0 1"/>
+                  <v:f eqn="prod @6 1 2"/>
+                  <v:f eqn="prod @7 21600 pixelWidth"/>
+                  <v:f eqn="sum @8 21600 0"/>
+                  <v:f eqn="prod @7 21600 pixelHeight"/>
+                  <v:f eqn="sum @10 21600 0"/>
+                </v:formulas>
+                <v:path o:extrusionok="f" gradientshapeok="t" o:connecttype="rect"/>
+                <o:lock v:ext="edit" aspectratio="t"/>
+              </v:shapetype>
+              <v:shape id="_x0000_i33" o:spid="_x0000_s33" type="#_x0000_t75" style="width:498.60pt;height:194.20pt;mso-wrap-distance-left:0.00pt;mso-wrap-distance-top:0.00pt;mso-wrap-distance-right:0.00pt;mso-wrap-distance-bottom:0.00pt;z-index:1;" stroked="false">
+                <v:imagedata r:id="rId20" o:title=""/>
+                <o:lock v:ext="edit" rotation="t"/>
+              </v:shape>
+            </w:pict>
+          </mc:Fallback>
+        </mc:AlternateContent>
+      </w:r>
+      <w:r>
+        <w:rPr>
+          <w:rFonts w:ascii="Times New Roman" w:hAnsi="Times New Roman" w:cs="Times New Roman"/>
+          <w:sz w:val="28"/>
+          <w:szCs w:val="28"/>
+        </w:rPr>
+      </w:r>
+      <w:r>
+        <w:rPr>
+          <w:rFonts w:ascii="Times New Roman" w:hAnsi="Times New Roman" w:cs="Times New Roman"/>
+          <w:sz w:val="28"/>
+          <w:szCs w:val="28"/>
+        </w:rPr>
+      </w:r>
+    </w:p>
+    <w:p>
+      <w:pPr>
+        <w:pStyle w:val="1301"/>
+        <w:pBdr/>
+        <w:spacing/>
+        <w:ind/>
+        <w:jc w:val="center"/>
+        <w:rPr>
+          <w:rFonts w:ascii="Times New Roman" w:hAnsi="Times New Roman" w:cs="Times New Roman"/>
+          <w:sz w:val="28"/>
+          <w:szCs w:val="28"/>
+        </w:rPr>
+      </w:pPr>
+      <w:r>
+        <w:rPr>
+          <w:rFonts w:ascii="Times New Roman" w:hAnsi="Times New Roman" w:cs="Times New Roman"/>
+          <w:sz w:val="28"/>
+          <w:szCs w:val="28"/>
+        </w:rPr>
+      </w:r>
+      <w:r>
+        <w:rPr>
+          <w:rFonts w:ascii="Times New Roman" w:hAnsi="Times New Roman" w:cs="Times New Roman"/>
+          <w:sz w:val="28"/>
+          <w:szCs w:val="28"/>
+          <w:lang w:val="uk-UA"/>
+        </w:rPr>
+        <w:t xml:space="preserve">Рис. </w:t>
+      </w:r>
+      <w:r>
+        <w:rPr>
+          <w:rFonts w:ascii="Times New Roman" w:hAnsi="Times New Roman" w:cs="Times New Roman"/>
+          <w:sz w:val="28"/>
+          <w:szCs w:val="28"/>
+          <w:lang w:val="en-US"/>
+        </w:rPr>
+        <w:t xml:space="preserve">6</w:t>
+      </w:r>
+      <w:r>
+        <w:rPr>
+          <w:rFonts w:ascii="Times New Roman" w:hAnsi="Times New Roman" w:cs="Times New Roman"/>
+          <w:sz w:val="28"/>
+          <w:szCs w:val="28"/>
+          <w:lang w:val="uk-UA"/>
+        </w:rPr>
+        <w:t xml:space="preserve">.</w:t>
+      </w:r>
+      <w:r>
+        <w:rPr>
+          <w:rFonts w:ascii="Times New Roman" w:hAnsi="Times New Roman" w:cs="Times New Roman"/>
+          <w:sz w:val="28"/>
+          <w:szCs w:val="28"/>
+          <w:lang w:val="en-US"/>
+        </w:rPr>
+        <w:t xml:space="preserve">4</w:t>
+      </w:r>
+      <w:r>
+        <w:rPr>
+          <w:rFonts w:ascii="Times New Roman" w:hAnsi="Times New Roman" w:cs="Times New Roman"/>
+          <w:sz w:val="28"/>
+          <w:szCs w:val="28"/>
+          <w:lang w:val="uk-UA"/>
+        </w:rPr>
+        <w:t xml:space="preserve"> – </w:t>
+      </w:r>
+      <w:r>
+        <w:rPr>
+          <w:rFonts w:ascii="Times New Roman" w:hAnsi="Times New Roman" w:cs="Times New Roman"/>
+          <w:sz w:val="28"/>
+          <w:szCs w:val="28"/>
+          <w:lang w:val="uk-UA"/>
+        </w:rPr>
+        <w:t xml:space="preserve">Налаштування </w:t>
+      </w:r>
+      <w:r>
+        <w:rPr>
+          <w:rFonts w:ascii="Times New Roman" w:hAnsi="Times New Roman" w:cs="Times New Roman"/>
+          <w:sz w:val="28"/>
+          <w:szCs w:val="28"/>
+          <w:lang w:val="en-US"/>
+        </w:rPr>
+        <w:t xml:space="preserve">fly-deploy</w:t>
+      </w:r>
+      <w:r>
+        <w:rPr>
+          <w:rFonts w:ascii="Times New Roman" w:hAnsi="Times New Roman" w:cs="Times New Roman"/>
+          <w:sz w:val="28"/>
+          <w:szCs w:val="28"/>
+        </w:rPr>
+      </w:r>
+      <w:r>
+        <w:rPr>
+          <w:rFonts w:ascii="Times New Roman" w:hAnsi="Times New Roman" w:cs="Times New Roman"/>
+          <w:sz w:val="28"/>
+          <w:szCs w:val="28"/>
+        </w:rPr>
+      </w:r>
+    </w:p>
+    <w:p>
+      <w:pPr>
+        <w:pStyle w:val="1301"/>
+        <w:pBdr/>
+        <w:spacing/>
+        <w:ind/>
+        <w:rPr>
+          <w:rFonts w:ascii="Times New Roman" w:hAnsi="Times New Roman" w:cs="Times New Roman"/>
+          <w:sz w:val="28"/>
+          <w:szCs w:val="28"/>
+        </w:rPr>
+      </w:pPr>
+      <w:r>
+        <w:rPr>
+          <w:rFonts w:ascii="Times New Roman" w:hAnsi="Times New Roman" w:cs="Times New Roman"/>
+          <w:sz w:val="28"/>
+          <w:szCs w:val="28"/>
+        </w:rPr>
+      </w:r>
+      <w:r>
+        <w:rPr>
+          <w:rFonts w:ascii="Times New Roman" w:hAnsi="Times New Roman" w:cs="Times New Roman"/>
+          <w:sz w:val="28"/>
+          <w:szCs w:val="28"/>
+        </w:rPr>
+      </w:r>
+      <w:r>
+        <w:rPr>
+          <w:rFonts w:ascii="Times New Roman" w:hAnsi="Times New Roman" w:cs="Times New Roman"/>
+          <w:sz w:val="28"/>
+          <w:szCs w:val="28"/>
+        </w:rPr>
+      </w:r>
+    </w:p>
+    <w:p>
+      <w:pPr>
+        <w:pStyle w:val="1301"/>
+        <w:pBdr/>
+        <w:spacing/>
+        <w:ind/>
+        <w:rPr>
+          <w:rFonts w:ascii="Times New Roman" w:hAnsi="Times New Roman" w:cs="Times New Roman"/>
+          <w:b/>
+          <w:bCs/>
+          <w:sz w:val="28"/>
+          <w:szCs w:val="28"/>
+        </w:rPr>
+      </w:pPr>
+      <w:r>
+        <w:rPr>
+          <w:rFonts w:ascii="Times New Roman" w:hAnsi="Times New Roman" w:cs="Times New Roman"/>
+          <w:sz w:val="28"/>
+          <w:szCs w:val="28"/>
+        </w:rPr>
+      </w:r>
+      <w:r>
+        <w:rPr>
+          <w:rFonts w:ascii="Times New Roman" w:hAnsi="Times New Roman" w:cs="Times New Roman"/>
+          <w:b/>
+          <w:bCs/>
+          <w:sz w:val="28"/>
+          <w:szCs w:val="28"/>
+          <w:lang w:val="uk-UA"/>
+        </w:rPr>
+        <w:t xml:space="preserve">Завдання 4</w:t>
+      </w:r>
+      <w:r>
+        <w:rPr>
+          <w:rFonts w:ascii="Times New Roman" w:hAnsi="Times New Roman" w:cs="Times New Roman"/>
+          <w:b/>
+          <w:bCs/>
+          <w:sz w:val="28"/>
+          <w:szCs w:val="28"/>
+        </w:rPr>
+      </w:r>
+    </w:p>
+    <w:p>
+      <w:pPr>
+        <w:pStyle w:val="1301"/>
+        <w:pBdr/>
+        <w:spacing/>
+        <w:ind/>
+        <w:rPr>
+          <w:rFonts w:ascii="Times New Roman" w:hAnsi="Times New Roman" w:cs="Times New Roman"/>
+          <w:sz w:val="32"/>
+          <w:szCs w:val="32"/>
+        </w:rPr>
+      </w:pPr>
+      <w:r>
+        <w:rPr>
+          <w:rFonts w:ascii="Times New Roman" w:hAnsi="Times New Roman" w:eastAsia="Times New Roman" w:cs="Times New Roman"/>
+          <w:sz w:val="32"/>
+          <w:szCs w:val="32"/>
+        </w:rPr>
+      </w:r>
+      <w:r>
+        <w:rPr>
+          <w:rFonts w:ascii="Times New Roman" w:hAnsi="Times New Roman" w:eastAsia="Times New Roman" w:cs="Times New Roman"/>
+          <w:sz w:val="28"/>
+          <w:szCs w:val="28"/>
+        </w:rPr>
+        <w:t xml:space="preserve">Healthcheck у fly.toml</w:t>
+      </w:r>
+      <w:r>
+        <w:rPr>
+          <w:rFonts w:ascii="Times New Roman" w:hAnsi="Times New Roman" w:eastAsia="Times New Roman" w:cs="Times New Roman"/>
+          <w:sz w:val="32"/>
+          <w:szCs w:val="32"/>
+        </w:rPr>
+      </w:r>
+      <w:r>
+        <w:rPr>
+          <w:rFonts w:ascii="Times New Roman" w:hAnsi="Times New Roman" w:eastAsia="Times New Roman" w:cs="Times New Roman"/>
+          <w:sz w:val="32"/>
+          <w:szCs w:val="32"/>
         </w:rPr>
       </w:r>
     </w:p>
@@ -3533,7 +3826,7 @@
           <mc:Choice Requires="wpg">
             <w:drawing>
               <wp:inline xmlns:wp="http://schemas.openxmlformats.org/drawingml/2006/wordprocessingDrawing" distT="0" distB="0" distL="0" distR="0">
-                <wp:extent cx="6332220" cy="1313738"/>
+                <wp:extent cx="5948385" cy="881565"/>
                 <wp:effectExtent l="0" t="0" r="0" b="0"/>
                 <wp:docPr id="13" name=""/>
                 <wp:cNvGraphicFramePr>
@@ -3543,7 +3836,7 @@
                   <a:graphicData uri="http://schemas.openxmlformats.org/drawingml/2006/picture">
                     <pic:pic xmlns:pic="http://schemas.openxmlformats.org/drawingml/2006/picture">
                       <pic:nvPicPr>
-                        <pic:cNvPr id="291694422" name=""/>
+                        <pic:cNvPr id="1740029136" name=""/>
                         <pic:cNvPicPr>
                           <a:picLocks noChangeAspect="1"/>
                         </pic:cNvPicPr>
@@ -3554,9 +3847,9 @@
                         <a:stretch/>
                       </pic:blipFill>
                       <pic:spPr bwMode="auto">
-                        <a:xfrm>
+                        <a:xfrm flipH="0" flipV="0">
                           <a:off x="0" y="0"/>
-                          <a:ext cx="6332219" cy="1313738"/>
+                          <a:ext cx="5948384" cy="881565"/>
                         </a:xfrm>
                         <a:prstGeom prst="rect">
                           <a:avLst/>
@@ -3589,7 +3882,7 @@
                 <v:path o:extrusionok="f" gradientshapeok="t" o:connecttype="rect"/>
                 <o:lock v:ext="edit" aspectratio="t"/>
               </v:shapetype>
-              <v:shape id="_x0000_i35" o:spid="_x0000_s35" type="#_x0000_t75" style="width:498.60pt;height:103.44pt;mso-wrap-distance-left:0.00pt;mso-wrap-distance-top:0.00pt;mso-wrap-distance-right:0.00pt;mso-wrap-distance-bottom:0.00pt;z-index:1;" stroked="false">
+              <v:shape id="_x0000_i35" o:spid="_x0000_s35" type="#_x0000_t75" style="width:468.38pt;height:69.41pt;mso-wrap-distance-left:0.00pt;mso-wrap-distance-top:0.00pt;mso-wrap-distance-right:0.00pt;mso-wrap-distance-bottom:0.00pt;z-index:1;" stroked="false">
                 <v:imagedata r:id="rId22" o:title=""/>
                 <o:lock v:ext="edit" rotation="t"/>
               </v:shape>
@@ -3597,6 +3890,14 @@
           </mc:Fallback>
         </mc:AlternateContent>
       </w:r>
+      <w:r>
+        <w:rPr>
+          <w:rFonts w:ascii="Times New Roman" w:hAnsi="Times New Roman" w:cs="Times New Roman"/>
+          <w:sz w:val="28"/>
+          <w:szCs w:val="28"/>
+        </w:rPr>
+      </w:r>
+      <w:r/>
       <w:r>
         <w:rPr>
           <w:rFonts w:ascii="Times New Roman" w:hAnsi="Times New Roman" w:cs="Times New Roman"/>
@@ -3639,23 +3940,16 @@
           <w:szCs w:val="28"/>
           <w:lang w:val="uk-UA"/>
         </w:rPr>
-        <w:t xml:space="preserve">Рис. 5.5 – Запуск </w:t>
+        <w:t xml:space="preserve">Рис. 5.5 – </w:t>
       </w:r>
       <w:r>
         <w:rPr>
           <w:rFonts w:ascii="Times New Roman" w:hAnsi="Times New Roman" w:cs="Times New Roman"/>
           <w:sz w:val="28"/>
           <w:szCs w:val="28"/>
-          <w:lang w:val="en-US"/>
+          <w:lang w:val="uk-UA"/>
         </w:rPr>
-        <w:t xml:space="preserve">docker compose</w:t>
-      </w:r>
-      <w:r>
-        <w:rPr>
-          <w:rFonts w:ascii="Times New Roman" w:hAnsi="Times New Roman" w:cs="Times New Roman"/>
-          <w:sz w:val="28"/>
-          <w:szCs w:val="28"/>
-        </w:rPr>
+        <w:t xml:space="preserve">Перевірка логів після успішного деплою</w:t>
       </w:r>
       <w:r>
         <w:rPr>
@@ -3705,174 +3999,12 @@
         <w:pBdr/>
         <w:spacing/>
         <w:ind/>
-        <w:rPr>
-          <w:rFonts w:ascii="Times New Roman" w:hAnsi="Times New Roman" w:cs="Times New Roman"/>
-          <w:sz w:val="28"/>
-          <w:szCs w:val="28"/>
-        </w:rPr>
-      </w:pPr>
-      <w:r>
-        <w:rPr>
-          <w:rFonts w:ascii="Times New Roman" w:hAnsi="Times New Roman" w:cs="Times New Roman"/>
-          <w:sz w:val="28"/>
-          <w:szCs w:val="28"/>
-        </w:rPr>
-      </w:r>
-      <w:r>
-        <w:rPr>
-          <w:rFonts w:ascii="Times New Roman" w:hAnsi="Times New Roman" w:cs="Times New Roman"/>
-          <w:sz w:val="28"/>
-          <w:szCs w:val="28"/>
-        </w:rPr>
-      </w:r>
-      <w:r>
-        <w:rPr>
-          <w:rFonts w:ascii="Times New Roman" w:hAnsi="Times New Roman" w:cs="Times New Roman"/>
-          <w:sz w:val="28"/>
-          <w:szCs w:val="28"/>
-        </w:rPr>
-      </w:r>
-    </w:p>
-    <w:p>
-      <w:pPr>
-        <w:pStyle w:val="1301"/>
-        <w:pBdr/>
-        <w:spacing/>
-        <w:ind/>
-        <w:rPr>
-          <w:rFonts w:ascii="Times New Roman" w:hAnsi="Times New Roman" w:cs="Times New Roman"/>
-          <w:b/>
-          <w:bCs/>
-          <w:sz w:val="28"/>
-          <w:szCs w:val="28"/>
-        </w:rPr>
-      </w:pPr>
-      <w:r>
-        <w:rPr>
-          <w:rFonts w:ascii="Times New Roman" w:hAnsi="Times New Roman" w:cs="Times New Roman"/>
-          <w:b/>
-          <w:bCs/>
-          <w:sz w:val="28"/>
-          <w:szCs w:val="28"/>
-        </w:rPr>
-      </w:r>
-      <w:r>
-        <w:rPr>
-          <w:rFonts w:ascii="Times New Roman" w:hAnsi="Times New Roman" w:cs="Times New Roman"/>
-          <w:b/>
-          <w:bCs/>
-          <w:sz w:val="28"/>
-          <w:szCs w:val="28"/>
-          <w:lang w:val="uk-UA"/>
-        </w:rPr>
-        <w:t xml:space="preserve">Завдання 4</w:t>
-      </w:r>
-      <w:r>
-        <w:rPr>
-          <w:rFonts w:ascii="Times New Roman" w:hAnsi="Times New Roman" w:cs="Times New Roman"/>
-          <w:b/>
-          <w:bCs/>
-          <w:sz w:val="28"/>
-          <w:szCs w:val="28"/>
-        </w:rPr>
-      </w:r>
-      <w:r>
-        <w:rPr>
-          <w:rFonts w:ascii="Times New Roman" w:hAnsi="Times New Roman" w:cs="Times New Roman"/>
-          <w:b/>
-          <w:bCs/>
-          <w:sz w:val="28"/>
-          <w:szCs w:val="28"/>
-        </w:rPr>
-      </w:r>
-    </w:p>
-    <w:p>
-      <w:pPr>
-        <w:pStyle w:val="1301"/>
-        <w:pBdr/>
-        <w:spacing/>
-        <w:ind/>
-        <w:rPr>
-          <w:rFonts w:ascii="Times New Roman" w:hAnsi="Times New Roman" w:cs="Times New Roman"/>
-          <w:sz w:val="32"/>
-          <w:szCs w:val="32"/>
-        </w:rPr>
-      </w:pPr>
-      <w:r>
-        <w:rPr>
-          <w:rFonts w:ascii="Times New Roman" w:hAnsi="Times New Roman" w:eastAsia="Times New Roman" w:cs="Times New Roman"/>
-          <w:sz w:val="32"/>
-          <w:szCs w:val="32"/>
-        </w:rPr>
-      </w:r>
-      <w:r>
-        <w:rPr>
-          <w:rFonts w:ascii="Times New Roman" w:hAnsi="Times New Roman" w:eastAsia="Times New Roman" w:cs="Times New Roman"/>
-          <w:sz w:val="28"/>
-          <w:szCs w:val="28"/>
-        </w:rPr>
-        <w:t xml:space="preserve">Додайте ендпоінт /health до застосунку та налаштуйте healthcheck у Docker Compose.</w:t>
-      </w:r>
-      <w:r>
-        <w:rPr>
-          <w:rFonts w:ascii="Times New Roman" w:hAnsi="Times New Roman" w:eastAsia="Times New Roman" w:cs="Times New Roman"/>
-          <w:sz w:val="32"/>
-          <w:szCs w:val="32"/>
-        </w:rPr>
-      </w:r>
-      <w:r>
-        <w:rPr>
-          <w:rFonts w:ascii="Times New Roman" w:hAnsi="Times New Roman" w:cs="Times New Roman"/>
-          <w:sz w:val="32"/>
-          <w:szCs w:val="32"/>
-        </w:rPr>
-      </w:r>
-    </w:p>
-    <w:p>
-      <w:pPr>
-        <w:pStyle w:val="1301"/>
-        <w:pBdr/>
-        <w:spacing/>
-        <w:ind/>
-        <w:rPr>
-          <w:rFonts w:ascii="Times New Roman" w:hAnsi="Times New Roman" w:cs="Times New Roman"/>
-          <w:sz w:val="28"/>
-          <w:szCs w:val="28"/>
-        </w:rPr>
-      </w:pPr>
-      <w:r>
-        <w:rPr>
-          <w:rFonts w:ascii="Times New Roman" w:hAnsi="Times New Roman" w:cs="Times New Roman"/>
-          <w:sz w:val="28"/>
-          <w:szCs w:val="28"/>
-        </w:rPr>
-      </w:r>
-      <w:r>
-        <w:rPr>
-          <w:rFonts w:ascii="Times New Roman" w:hAnsi="Times New Roman" w:cs="Times New Roman"/>
-          <w:sz w:val="28"/>
-          <w:szCs w:val="28"/>
-        </w:rPr>
-      </w:r>
-      <w:r>
-        <w:rPr>
-          <w:rFonts w:ascii="Times New Roman" w:hAnsi="Times New Roman" w:cs="Times New Roman"/>
-          <w:sz w:val="28"/>
-          <w:szCs w:val="28"/>
-        </w:rPr>
-      </w:r>
-    </w:p>
-    <w:p>
-      <w:pPr>
-        <w:pStyle w:val="1301"/>
-        <w:pBdr/>
-        <w:spacing/>
-        <w:ind/>
         <w:jc w:val="center"/>
         <w:rPr>
           <w:rFonts w:ascii="Times New Roman" w:hAnsi="Times New Roman" w:cs="Times New Roman"/>
           <w:sz w:val="28"/>
           <w:szCs w:val="28"/>
+          <w:highlight w:val="none"/>
         </w:rPr>
       </w:pPr>
       <w:r>
@@ -3887,7 +4019,7 @@
           <mc:Choice Requires="wpg">
             <w:drawing>
               <wp:inline xmlns:wp="http://schemas.openxmlformats.org/drawingml/2006/wordprocessingDrawing" distT="0" distB="0" distL="0" distR="0">
-                <wp:extent cx="4729185" cy="4224739"/>
+                <wp:extent cx="5276850" cy="6819900"/>
                 <wp:effectExtent l="0" t="0" r="0" b="0"/>
                 <wp:docPr id="14" name=""/>
                 <wp:cNvGraphicFramePr>
@@ -3897,7 +4029,7 @@
                   <a:graphicData uri="http://schemas.openxmlformats.org/drawingml/2006/picture">
                     <pic:pic xmlns:pic="http://schemas.openxmlformats.org/drawingml/2006/picture">
                       <pic:nvPicPr>
-                        <pic:cNvPr id="472072187" name=""/>
+                        <pic:cNvPr id="779535373" name=""/>
                         <pic:cNvPicPr>
                           <a:picLocks noChangeAspect="1"/>
                         </pic:cNvPicPr>
@@ -3908,9 +4040,9 @@
                         <a:stretch/>
                       </pic:blipFill>
                       <pic:spPr bwMode="auto">
-                        <a:xfrm flipH="0" flipV="0">
+                        <a:xfrm>
                           <a:off x="0" y="0"/>
-                          <a:ext cx="4729185" cy="4224738"/>
+                          <a:ext cx="5276849" cy="6819899"/>
                         </a:xfrm>
                         <a:prstGeom prst="rect">
                           <a:avLst/>
@@ -3943,7 +4075,7 @@
                 <v:path o:extrusionok="f" gradientshapeok="t" o:connecttype="rect"/>
                 <o:lock v:ext="edit" aspectratio="t"/>
               </v:shapetype>
-              <v:shape id="_x0000_i36" o:spid="_x0000_s36" type="#_x0000_t75" style="width:372.38pt;height:332.66pt;mso-wrap-distance-left:0.00pt;mso-wrap-distance-top:0.00pt;mso-wrap-distance-right:0.00pt;mso-wrap-distance-bottom:0.00pt;z-index:1;" stroked="false">
+              <v:shape id="_x0000_i36" o:spid="_x0000_s36" type="#_x0000_t75" style="width:415.50pt;height:537.00pt;mso-wrap-distance-left:0.00pt;mso-wrap-distance-top:0.00pt;mso-wrap-distance-right:0.00pt;mso-wrap-distance-bottom:0.00pt;z-index:1;" stroked="false">
                 <v:imagedata r:id="rId23" o:title=""/>
                 <o:lock v:ext="edit" rotation="t"/>
               </v:shape>
@@ -3965,6 +4097,13 @@
           <w:szCs w:val="28"/>
         </w:rPr>
       </w:r>
+      <w:r>
+        <w:rPr>
+          <w:rFonts w:ascii="Times New Roman" w:hAnsi="Times New Roman" w:cs="Times New Roman"/>
+          <w:sz w:val="28"/>
+          <w:szCs w:val="28"/>
+        </w:rPr>
+      </w:r>
     </w:p>
     <w:p>
       <w:pPr>
@@ -3984,18 +4123,117 @@
           <w:rFonts w:ascii="Times New Roman" w:hAnsi="Times New Roman" w:cs="Times New Roman"/>
           <w:sz w:val="28"/>
           <w:szCs w:val="28"/>
+          <w:highlight w:val="none"/>
           <w:lang w:val="uk-UA"/>
         </w:rPr>
-        <w:t xml:space="preserve">Рис. 5.6 – Додав </w:t>
+        <w:t xml:space="preserve">Додано блок перевірки h</w:t>
       </w:r>
       <w:r>
         <w:rPr>
           <w:rFonts w:ascii="Times New Roman" w:hAnsi="Times New Roman" w:cs="Times New Roman"/>
           <w:sz w:val="28"/>
           <w:szCs w:val="28"/>
+          <w:highlight w:val="none"/>
           <w:lang w:val="en-US"/>
         </w:rPr>
-        <w:t xml:space="preserve">GET health</w:t>
+        <w:t xml:space="preserve">ealth</w:t>
+      </w:r>
+      <w:r>
+        <w:rPr>
+          <w:rFonts w:ascii="Times New Roman" w:hAnsi="Times New Roman" w:cs="Times New Roman"/>
+          <w:sz w:val="28"/>
+          <w:szCs w:val="28"/>
+          <w:highlight w:val="none"/>
+        </w:rPr>
+      </w:r>
+      <w:r>
+        <w:rPr>
+          <w:rFonts w:ascii="Times New Roman" w:hAnsi="Times New Roman" w:cs="Times New Roman"/>
+          <w:sz w:val="28"/>
+          <w:szCs w:val="28"/>
+          <w:highlight w:val="none"/>
+        </w:rPr>
+      </w:r>
+    </w:p>
+    <w:p>
+      <w:pPr>
+        <w:pStyle w:val="1301"/>
+        <w:pBdr/>
+        <w:spacing/>
+        <w:ind/>
+        <w:rPr>
+          <w:rFonts w:ascii="Times New Roman" w:hAnsi="Times New Roman" w:cs="Times New Roman"/>
+          <w:sz w:val="28"/>
+          <w:szCs w:val="28"/>
+        </w:rPr>
+      </w:pPr>
+      <w:r>
+        <w:rPr>
+          <w:rFonts w:ascii="Times New Roman" w:hAnsi="Times New Roman" w:cs="Times New Roman"/>
+          <w:sz w:val="28"/>
+          <w:szCs w:val="28"/>
+        </w:rPr>
+      </w:r>
+      <w:r>
+        <w:rPr>
+          <w:rFonts w:ascii="Times New Roman" w:hAnsi="Times New Roman" w:cs="Times New Roman"/>
+          <w:sz w:val="28"/>
+          <w:szCs w:val="28"/>
+        </w:rPr>
+      </w:r>
+      <w:r>
+        <w:rPr>
+          <w:rFonts w:ascii="Times New Roman" w:hAnsi="Times New Roman" w:cs="Times New Roman"/>
+          <w:sz w:val="28"/>
+          <w:szCs w:val="28"/>
+        </w:rPr>
+      </w:r>
+    </w:p>
+    <w:p>
+      <w:pPr>
+        <w:pStyle w:val="1301"/>
+        <w:pBdr/>
+        <w:spacing/>
+        <w:ind/>
+        <w:rPr>
+          <w:rFonts w:ascii="Times New Roman" w:hAnsi="Times New Roman" w:cs="Times New Roman"/>
+          <w:sz w:val="28"/>
+          <w:szCs w:val="28"/>
+        </w:rPr>
+      </w:pPr>
+      <w:r>
+        <w:rPr>
+          <w:rFonts w:ascii="Times New Roman" w:hAnsi="Times New Roman" w:cs="Times New Roman"/>
+          <w:sz w:val="28"/>
+          <w:szCs w:val="28"/>
+        </w:rPr>
+      </w:r>
+      <w:r>
+        <w:rPr>
+          <w:rFonts w:ascii="Times New Roman" w:hAnsi="Times New Roman" w:cs="Times New Roman"/>
+          <w:sz w:val="28"/>
+          <w:szCs w:val="28"/>
+        </w:rPr>
+      </w:r>
+    </w:p>
+    <w:p>
+      <w:pPr>
+        <w:pStyle w:val="1301"/>
+        <w:pBdr/>
+        <w:spacing/>
+        <w:ind/>
+        <w:rPr>
+          <w:rFonts w:ascii="Times New Roman" w:hAnsi="Times New Roman" w:cs="Times New Roman"/>
+          <w:sz w:val="28"/>
+          <w:szCs w:val="28"/>
+        </w:rPr>
+      </w:pPr>
+      <w:r>
+        <w:rPr>
+          <w:rFonts w:ascii="Times New Roman" w:hAnsi="Times New Roman" w:cs="Times New Roman"/>
+          <w:sz w:val="28"/>
+          <w:szCs w:val="28"/>
+        </w:rPr>
       </w:r>
       <w:r>
         <w:rPr>

</xml_diff>